<commit_message>
Descrição das alterações realizadas
</commit_message>
<xml_diff>
--- a/labs/lab05/report/net-os-admin--lab05--report.docx
+++ b/labs/lab05/report/net-os-admin--lab05--report.docx
@@ -70,7 +70,7 @@
       </w:r>
     </w:p>
     <w:bookmarkEnd w:id="20"/>
-    <w:bookmarkStart w:id="61" w:name="выполнение-лабораторной-работы"/>
+    <w:bookmarkStart w:id="70" w:name="выполнение-лабораторной-работы"/>
     <w:p>
       <w:pPr>
         <w:pStyle w:val="Heading1"/>
@@ -79,7 +79,7 @@
         <w:t xml:space="preserve">2. Выполнение лабораторной работы</w:t>
       </w:r>
     </w:p>
-    <w:bookmarkStart w:id="38" w:name="X14b806e36eee771cf63a7ed738c451d8f764bd2"/>
+    <w:bookmarkStart w:id="42" w:name="X14b806e36eee771cf63a7ed738c451d8f764bd2"/>
     <w:p>
       <w:pPr>
         <w:pStyle w:val="Heading2"/>
@@ -120,7 +120,7 @@
         <w:t xml:space="preserve">openssl req -x509 -nodes -newkey rsa:2048</w:t>
       </w:r>
       <w:r>
-        <w:t xml:space="preserve">. В процессе генерации были заданы параметры DN: код страны — RU, страна — Russia, город — Moscow, организация и подразделение — bahis, общее имя (CN) — bahis.net, e-mail —</w:t>
+        <w:t xml:space="preserve">. В процессе генерации были заданы параметры DN: код страны — RU, страна — Russia, город — Moscow, организация и подразделение — user, общее имя (CN) — user.net, e-mail —</w:t>
       </w:r>
       <w:r>
         <w:t xml:space="preserve"> </w:t>
@@ -130,7 +130,7 @@
           <w:rPr>
             <w:rStyle w:val="Hyperlink"/>
           </w:rPr>
-          <w:t xml:space="preserve">bahis@bahis.net</w:t>
+          <w:t xml:space="preserve">user@user.net</w:t>
         </w:r>
       </w:hyperlink>
       <w:r>
@@ -151,1411 +151,1231 @@
       <w:r>
         <w:t xml:space="preserve">(</w:t>
       </w:r>
-      <w:hyperlink w:anchor="fig-1">
+      <w:r>
+        <w:rPr>
+          <w:b/>
+          <w:bCs/>
+        </w:rPr>
+        <w:t xml:space="preserve">?@fig-1</w:t>
+      </w:r>
+      <w:r>
+        <w:t xml:space="preserve">).</w:t>
+      </w:r>
+    </w:p>
+    <w:p>
+      <w:pPr>
+        <w:pStyle w:val="BodyText"/>
+      </w:pPr>
+      <w:bookmarkStart w:id="25" w:name="fig-1"/>
+      <w:r>
+        <w:drawing>
+          <wp:inline>
+            <wp:extent cx="3733800" cy="962083"/>
+            <wp:effectExtent b="0" l="0" r="0" t="0"/>
+            <wp:docPr descr="Генерация самоподписанного SSL-сертификата и закрытого ключа OpenSSL" title="" id="23" name="Picture"/>
+            <a:graphic>
+              <a:graphicData uri="http://schemas.openxmlformats.org/drawingml/2006/picture">
+                <pic:pic>
+                  <pic:nvPicPr>
+                    <pic:cNvPr descr="image/1.png" id="24" name="Picture"/>
+                    <pic:cNvPicPr>
+                      <a:picLocks noChangeArrowheads="1" noChangeAspect="1"/>
+                    </pic:cNvPicPr>
+                  </pic:nvPicPr>
+                  <pic:blipFill>
+                    <a:blip r:embed="rId22"/>
+                    <a:stretch>
+                      <a:fillRect/>
+                    </a:stretch>
+                  </pic:blipFill>
+                  <pic:spPr bwMode="auto">
+                    <a:xfrm>
+                      <a:off x="0" y="0"/>
+                      <a:ext cx="3733800" cy="962083"/>
+                    </a:xfrm>
+                    <a:prstGeom prst="rect">
+                      <a:avLst/>
+                    </a:prstGeom>
+                    <a:noFill/>
+                    <a:ln w="9525">
+                      <a:noFill/>
+                      <a:headEnd/>
+                      <a:tailEnd/>
+                    </a:ln>
+                  </pic:spPr>
+                </pic:pic>
+              </a:graphicData>
+            </a:graphic>
+          </wp:inline>
+        </w:drawing>
+      </w:r>
+      <w:bookmarkEnd w:id="25"/>
+      <w:r>
+        <w:t xml:space="preserve"> </w:t>
+      </w:r>
+      <w:hyperlink r:id="rId26">
         <w:r>
           <w:rPr>
             <w:rStyle w:val="Hyperlink"/>
           </w:rPr>
-          <w:t xml:space="preserve">рис. 1</w:t>
+          <w:t xml:space="preserve">Нажмите здесь, чтобы открыть ссылку.</w:t>
         </w:r>
       </w:hyperlink>
+    </w:p>
+    <w:p>
+      <w:pPr>
+        <w:pStyle w:val="BodyText"/>
+      </w:pPr>
+      <w:r>
+        <w:t xml:space="preserve">Далее был отредактирован конфигурационный файл виртуального хоста</w:t>
+      </w:r>
+      <w:r>
+        <w:t xml:space="preserve"> </w:t>
+      </w:r>
+      <w:r>
+        <w:rPr>
+          <w:rStyle w:val="VerbatimChar"/>
+        </w:rPr>
+        <w:t xml:space="preserve">/etc/httpd/conf.d/www.bahis.net.conf</w:t>
+      </w:r>
+      <w:r>
+        <w:t xml:space="preserve">. В блоке</w:t>
+      </w:r>
+      <w:r>
+        <w:t xml:space="preserve"> </w:t>
+      </w:r>
+      <w:r>
+        <w:rPr>
+          <w:rStyle w:val="VerbatimChar"/>
+        </w:rPr>
+        <w:t xml:space="preserve">&lt;VirtualHost *:80&gt;</w:t>
+      </w:r>
+      <w:r>
+        <w:t xml:space="preserve"> </w:t>
+      </w:r>
+      <w:r>
+        <w:t xml:space="preserve">задана переадресация HTTP-запросов на HTTPS с использованием</w:t>
+      </w:r>
+      <w:r>
+        <w:t xml:space="preserve"> </w:t>
+      </w:r>
+      <w:r>
+        <w:rPr>
+          <w:rStyle w:val="VerbatimChar"/>
+        </w:rPr>
+        <w:t xml:space="preserve">RewriteRule</w:t>
+      </w:r>
+      <w:r>
+        <w:t xml:space="preserve">. В блоке</w:t>
+      </w:r>
+      <w:r>
+        <w:t xml:space="preserve"> </w:t>
+      </w:r>
+      <w:r>
+        <w:rPr>
+          <w:rStyle w:val="VerbatimChar"/>
+        </w:rPr>
+        <w:t xml:space="preserve">&lt;VirtualHost *:443&gt;</w:t>
+      </w:r>
+      <w:r>
+        <w:t xml:space="preserve"> </w:t>
+      </w:r>
+      <w:r>
+        <w:t xml:space="preserve">включён модуль SSL (</w:t>
+      </w:r>
+      <w:r>
+        <w:rPr>
+          <w:rStyle w:val="VerbatimChar"/>
+        </w:rPr>
+        <w:t xml:space="preserve">SSLEngine on</w:t>
+      </w:r>
+      <w:r>
+        <w:t xml:space="preserve">), указаны пути к файлам сертификата (</w:t>
+      </w:r>
+      <w:r>
+        <w:rPr>
+          <w:rStyle w:val="VerbatimChar"/>
+        </w:rPr>
+        <w:t xml:space="preserve">SSLCertificateFile</w:t>
+      </w:r>
+      <w:r>
+        <w:t xml:space="preserve">) и закрытого ключа (</w:t>
+      </w:r>
+      <w:r>
+        <w:rPr>
+          <w:rStyle w:val="VerbatimChar"/>
+        </w:rPr>
+        <w:t xml:space="preserve">SSLCertificateKeyFile</w:t>
+      </w:r>
+      <w:r>
+        <w:t xml:space="preserve">), а также параметры журнала и корневой каталог сайта (</w:t>
+      </w:r>
+      <w:r>
+        <w:rPr>
+          <w:b/>
+          <w:bCs/>
+        </w:rPr>
+        <w:t xml:space="preserve">?@fig-2</w:t>
+      </w:r>
       <w:r>
         <w:t xml:space="preserve">).</w:t>
       </w:r>
     </w:p>
-    <w:tbl>
-      <w:tblPr>
-        <w:tblStyle w:val="Table"/>
-        <w:tblW w:type="pct" w:w="5000"/>
-        <w:tblLayout w:type="fixed"/>
-        <w:tblLook w:firstRow="0" w:lastRow="0" w:firstColumn="0" w:lastColumn="0" w:noHBand="0" w:noVBand="0" w:val="0000"/>
-      </w:tblPr>
-      <w:tblGrid>
-        <w:gridCol w:w="7920"/>
-      </w:tblGrid>
-      <w:tr>
-        <w:tc>
-          <w:tcPr/>
-          <w:bookmarkStart w:id="25" w:name="fig-1"/>
-          <w:p>
-            <w:pPr>
-              <w:pStyle w:val="Compact"/>
-              <w:jc w:val="center"/>
-            </w:pPr>
-            <w:r>
-              <w:drawing>
-                <wp:inline>
-                  <wp:extent cx="3733800" cy="962083"/>
-                  <wp:effectExtent b="0" l="0" r="0" t="0"/>
-                  <wp:docPr descr="" title="" id="23" name="Picture"/>
-                  <a:graphic>
-                    <a:graphicData uri="http://schemas.openxmlformats.org/drawingml/2006/picture">
-                      <pic:pic>
-                        <pic:nvPicPr>
-                          <pic:cNvPr descr="image/1.png" id="24" name="Picture"/>
-                          <pic:cNvPicPr>
-                            <a:picLocks noChangeArrowheads="1" noChangeAspect="1"/>
-                          </pic:cNvPicPr>
-                        </pic:nvPicPr>
-                        <pic:blipFill>
-                          <a:blip r:embed="rId22"/>
-                          <a:stretch>
-                            <a:fillRect/>
-                          </a:stretch>
-                        </pic:blipFill>
-                        <pic:spPr bwMode="auto">
-                          <a:xfrm>
-                            <a:off x="0" y="0"/>
-                            <a:ext cx="3733800" cy="962083"/>
-                          </a:xfrm>
-                          <a:prstGeom prst="rect">
-                            <a:avLst/>
-                          </a:prstGeom>
-                          <a:noFill/>
-                          <a:ln w="9525">
-                            <a:noFill/>
-                            <a:headEnd/>
-                            <a:tailEnd/>
-                          </a:ln>
-                        </pic:spPr>
-                      </pic:pic>
-                    </a:graphicData>
-                  </a:graphic>
-                </wp:inline>
-              </w:drawing>
-            </w:r>
-          </w:p>
-          <w:p>
-            <w:pPr>
-              <w:jc w:val="center"/>
-            </w:pPr>
-            <w:pPr>
-              <w:jc w:val="start"/>
-              <w:spacing w:before="200"/>
-              <w:pStyle w:val="ImageCaption"/>
-            </w:pPr>
-            <w:r>
-              <w:t xml:space="preserve">Рисунок 1: Генерация самоподписанного SSL-сертификата и закрытого ключа OpenSSL</w:t>
-            </w:r>
-          </w:p>
-          <w:bookmarkEnd w:id="25"/>
-        </w:tc>
-      </w:tr>
-    </w:tbl>
     <w:p>
       <w:pPr>
         <w:pStyle w:val="BodyText"/>
       </w:pPr>
-      <w:r>
-        <w:t xml:space="preserve">Далее был отредактирован конфигурационный файл виртуального хоста</w:t>
-      </w:r>
-      <w:r>
-        <w:t xml:space="preserve"> </w:t>
-      </w:r>
-      <w:r>
-        <w:rPr>
-          <w:rStyle w:val="VerbatimChar"/>
-        </w:rPr>
-        <w:t xml:space="preserve">/etc/httpd/conf.d/www.bahis.net.conf</w:t>
-      </w:r>
-      <w:r>
-        <w:t xml:space="preserve">. В блоке</w:t>
-      </w:r>
-      <w:r>
-        <w:t xml:space="preserve"> </w:t>
-      </w:r>
-      <w:r>
-        <w:rPr>
-          <w:rStyle w:val="VerbatimChar"/>
-        </w:rPr>
-        <w:t xml:space="preserve">&lt;VirtualHost *:80&gt;</w:t>
-      </w:r>
-      <w:r>
-        <w:t xml:space="preserve"> </w:t>
-      </w:r>
-      <w:r>
-        <w:t xml:space="preserve">задана переадресация HTTP-запросов на HTTPS с использованием</w:t>
-      </w:r>
-      <w:r>
-        <w:t xml:space="preserve"> </w:t>
-      </w:r>
-      <w:r>
-        <w:rPr>
-          <w:rStyle w:val="VerbatimChar"/>
-        </w:rPr>
-        <w:t xml:space="preserve">RewriteRule</w:t>
-      </w:r>
-      <w:r>
-        <w:t xml:space="preserve">. В блоке</w:t>
-      </w:r>
-      <w:r>
-        <w:t xml:space="preserve"> </w:t>
-      </w:r>
-      <w:r>
-        <w:rPr>
-          <w:rStyle w:val="VerbatimChar"/>
-        </w:rPr>
-        <w:t xml:space="preserve">&lt;VirtualHost *:443&gt;</w:t>
-      </w:r>
-      <w:r>
-        <w:t xml:space="preserve"> </w:t>
-      </w:r>
-      <w:r>
-        <w:t xml:space="preserve">включён модуль SSL (</w:t>
-      </w:r>
-      <w:r>
-        <w:rPr>
-          <w:rStyle w:val="VerbatimChar"/>
-        </w:rPr>
-        <w:t xml:space="preserve">SSLEngine on</w:t>
-      </w:r>
-      <w:r>
-        <w:t xml:space="preserve">), указаны пути к файлам сертификата (</w:t>
-      </w:r>
-      <w:r>
-        <w:rPr>
-          <w:rStyle w:val="VerbatimChar"/>
-        </w:rPr>
-        <w:t xml:space="preserve">SSLCertificateFile</w:t>
-      </w:r>
-      <w:r>
-        <w:t xml:space="preserve">) и закрытого ключа (</w:t>
-      </w:r>
-      <w:r>
-        <w:rPr>
-          <w:rStyle w:val="VerbatimChar"/>
-        </w:rPr>
-        <w:t xml:space="preserve">SSLCertificateKeyFile</w:t>
-      </w:r>
-      <w:r>
-        <w:t xml:space="preserve">), а также параметры журнала и корневой каталог сайта (</w:t>
-      </w:r>
-      <w:hyperlink w:anchor="fig-2">
+      <w:bookmarkStart w:id="30" w:name="fig-2"/>
+      <w:r>
+        <w:drawing>
+          <wp:inline>
+            <wp:extent cx="3733800" cy="1559688"/>
+            <wp:effectExtent b="0" l="0" r="0" t="0"/>
+            <wp:docPr descr="Конфигурация виртуального хоста Apache для HTTPS" title="" id="28" name="Picture"/>
+            <a:graphic>
+              <a:graphicData uri="http://schemas.openxmlformats.org/drawingml/2006/picture">
+                <pic:pic>
+                  <pic:nvPicPr>
+                    <pic:cNvPr descr="image/2.png" id="29" name="Picture"/>
+                    <pic:cNvPicPr>
+                      <a:picLocks noChangeArrowheads="1" noChangeAspect="1"/>
+                    </pic:cNvPicPr>
+                  </pic:nvPicPr>
+                  <pic:blipFill>
+                    <a:blip r:embed="rId27"/>
+                    <a:stretch>
+                      <a:fillRect/>
+                    </a:stretch>
+                  </pic:blipFill>
+                  <pic:spPr bwMode="auto">
+                    <a:xfrm>
+                      <a:off x="0" y="0"/>
+                      <a:ext cx="3733800" cy="1559688"/>
+                    </a:xfrm>
+                    <a:prstGeom prst="rect">
+                      <a:avLst/>
+                    </a:prstGeom>
+                    <a:noFill/>
+                    <a:ln w="9525">
+                      <a:noFill/>
+                      <a:headEnd/>
+                      <a:tailEnd/>
+                    </a:ln>
+                  </pic:spPr>
+                </pic:pic>
+              </a:graphicData>
+            </a:graphic>
+          </wp:inline>
+        </w:drawing>
+      </w:r>
+      <w:bookmarkEnd w:id="30"/>
+      <w:r>
+        <w:t xml:space="preserve"> </w:t>
+      </w:r>
+      <w:hyperlink r:id="rId31">
         <w:r>
           <w:rPr>
             <w:rStyle w:val="Hyperlink"/>
           </w:rPr>
-          <w:t xml:space="preserve">рис. 2</w:t>
+          <w:t xml:space="preserve">Нажмите здесь, чтобы открыть ссылку.</w:t>
         </w:r>
       </w:hyperlink>
+    </w:p>
+    <w:p>
+      <w:pPr>
+        <w:pStyle w:val="BodyText"/>
+      </w:pPr>
+      <w:r>
+        <w:t xml:space="preserve">После изменения конфигурации были внесены корректировки в настройки межсетевого экрана: выполнена проверка активных и доступных сервисов, добавлен сервис</w:t>
+      </w:r>
+      <w:r>
+        <w:t xml:space="preserve"> </w:t>
+      </w:r>
+      <w:r>
+        <w:rPr>
+          <w:rStyle w:val="VerbatimChar"/>
+        </w:rPr>
+        <w:t xml:space="preserve">https</w:t>
+      </w:r>
+      <w:r>
+        <w:t xml:space="preserve">, изменения сохранены как постоянные и применены с помощью перезагрузки правил. Затем выполнен перезапуск службы</w:t>
+      </w:r>
+      <w:r>
+        <w:t xml:space="preserve"> </w:t>
+      </w:r>
+      <w:r>
+        <w:rPr>
+          <w:rStyle w:val="VerbatimChar"/>
+        </w:rPr>
+        <w:t xml:space="preserve">httpd</w:t>
+      </w:r>
+      <w:r>
+        <w:t xml:space="preserve"> </w:t>
+      </w:r>
+      <w:r>
+        <w:t xml:space="preserve">для применения новой конфигурации (</w:t>
+      </w:r>
+      <w:r>
+        <w:rPr>
+          <w:b/>
+          <w:bCs/>
+        </w:rPr>
+        <w:t xml:space="preserve">?@fig-3</w:t>
+      </w:r>
       <w:r>
         <w:t xml:space="preserve">).</w:t>
       </w:r>
     </w:p>
-    <w:tbl>
-      <w:tblPr>
-        <w:tblStyle w:val="Table"/>
-        <w:tblW w:type="pct" w:w="5000"/>
-        <w:tblLayout w:type="fixed"/>
-        <w:tblLook w:firstRow="0" w:lastRow="0" w:firstColumn="0" w:lastColumn="0" w:noHBand="0" w:noVBand="0" w:val="0000"/>
-      </w:tblPr>
-      <w:tblGrid>
-        <w:gridCol w:w="7920"/>
-      </w:tblGrid>
-      <w:tr>
-        <w:tc>
-          <w:tcPr/>
-          <w:bookmarkStart w:id="29" w:name="fig-2"/>
-          <w:p>
-            <w:pPr>
-              <w:pStyle w:val="Compact"/>
-              <w:jc w:val="center"/>
-            </w:pPr>
-            <w:r>
-              <w:drawing>
-                <wp:inline>
-                  <wp:extent cx="3733800" cy="1559688"/>
-                  <wp:effectExtent b="0" l="0" r="0" t="0"/>
-                  <wp:docPr descr="" title="" id="27" name="Picture"/>
-                  <a:graphic>
-                    <a:graphicData uri="http://schemas.openxmlformats.org/drawingml/2006/picture">
-                      <pic:pic>
-                        <pic:nvPicPr>
-                          <pic:cNvPr descr="image/2.png" id="28" name="Picture"/>
-                          <pic:cNvPicPr>
-                            <a:picLocks noChangeArrowheads="1" noChangeAspect="1"/>
-                          </pic:cNvPicPr>
-                        </pic:nvPicPr>
-                        <pic:blipFill>
-                          <a:blip r:embed="rId26"/>
-                          <a:stretch>
-                            <a:fillRect/>
-                          </a:stretch>
-                        </pic:blipFill>
-                        <pic:spPr bwMode="auto">
-                          <a:xfrm>
-                            <a:off x="0" y="0"/>
-                            <a:ext cx="3733800" cy="1559688"/>
-                          </a:xfrm>
-                          <a:prstGeom prst="rect">
-                            <a:avLst/>
-                          </a:prstGeom>
-                          <a:noFill/>
-                          <a:ln w="9525">
-                            <a:noFill/>
-                            <a:headEnd/>
-                            <a:tailEnd/>
-                          </a:ln>
-                        </pic:spPr>
-                      </pic:pic>
-                    </a:graphicData>
-                  </a:graphic>
-                </wp:inline>
-              </w:drawing>
-            </w:r>
-          </w:p>
-          <w:p>
-            <w:pPr>
-              <w:jc w:val="center"/>
-            </w:pPr>
-            <w:pPr>
-              <w:jc w:val="start"/>
-              <w:spacing w:before="200"/>
-              <w:pStyle w:val="ImageCaption"/>
-            </w:pPr>
-            <w:r>
-              <w:t xml:space="preserve">Рисунок 2: Конфигурация виртуального хоста Apache для HTTPS</w:t>
-            </w:r>
-          </w:p>
-          <w:bookmarkEnd w:id="29"/>
-        </w:tc>
-      </w:tr>
-    </w:tbl>
     <w:p>
       <w:pPr>
         <w:pStyle w:val="BodyText"/>
       </w:pPr>
-      <w:r>
-        <w:t xml:space="preserve">После изменения конфигурации были внесены корректировки в настройки межсетевого экрана: выполнена проверка активных и доступных сервисов, добавлен сервис</w:t>
-      </w:r>
-      <w:r>
-        <w:t xml:space="preserve"> </w:t>
-      </w:r>
-      <w:r>
-        <w:rPr>
-          <w:rStyle w:val="VerbatimChar"/>
-        </w:rPr>
-        <w:t xml:space="preserve">https</w:t>
-      </w:r>
-      <w:r>
-        <w:t xml:space="preserve">, изменения сохранены как постоянные и применены с помощью перезагрузки правил. Затем выполнен перезапуск службы</w:t>
-      </w:r>
-      <w:r>
-        <w:t xml:space="preserve"> </w:t>
-      </w:r>
-      <w:r>
-        <w:rPr>
-          <w:rStyle w:val="VerbatimChar"/>
-        </w:rPr>
-        <w:t xml:space="preserve">httpd</w:t>
-      </w:r>
-      <w:r>
-        <w:t xml:space="preserve"> </w:t>
-      </w:r>
-      <w:r>
-        <w:t xml:space="preserve">для применения новой конфигурации (</w:t>
-      </w:r>
-      <w:hyperlink w:anchor="fig-3">
+      <w:bookmarkStart w:id="35" w:name="fig-3"/>
+      <w:r>
+        <w:drawing>
+          <wp:inline>
+            <wp:extent cx="3733800" cy="2613264"/>
+            <wp:effectExtent b="0" l="0" r="0" t="0"/>
+            <wp:docPr descr="Настройка firewalld и перезапуск службы httpd" title="" id="33" name="Picture"/>
+            <a:graphic>
+              <a:graphicData uri="http://schemas.openxmlformats.org/drawingml/2006/picture">
+                <pic:pic>
+                  <pic:nvPicPr>
+                    <pic:cNvPr descr="image/3.png" id="34" name="Picture"/>
+                    <pic:cNvPicPr>
+                      <a:picLocks noChangeArrowheads="1" noChangeAspect="1"/>
+                    </pic:cNvPicPr>
+                  </pic:nvPicPr>
+                  <pic:blipFill>
+                    <a:blip r:embed="rId32"/>
+                    <a:stretch>
+                      <a:fillRect/>
+                    </a:stretch>
+                  </pic:blipFill>
+                  <pic:spPr bwMode="auto">
+                    <a:xfrm>
+                      <a:off x="0" y="0"/>
+                      <a:ext cx="3733800" cy="2613264"/>
+                    </a:xfrm>
+                    <a:prstGeom prst="rect">
+                      <a:avLst/>
+                    </a:prstGeom>
+                    <a:noFill/>
+                    <a:ln w="9525">
+                      <a:noFill/>
+                      <a:headEnd/>
+                      <a:tailEnd/>
+                    </a:ln>
+                  </pic:spPr>
+                </pic:pic>
+              </a:graphicData>
+            </a:graphic>
+          </wp:inline>
+        </w:drawing>
+      </w:r>
+      <w:bookmarkEnd w:id="35"/>
+      <w:r>
+        <w:t xml:space="preserve"> </w:t>
+      </w:r>
+      <w:hyperlink r:id="rId36">
         <w:r>
           <w:rPr>
             <w:rStyle w:val="Hyperlink"/>
           </w:rPr>
-          <w:t xml:space="preserve">рис. 3</w:t>
+          <w:t xml:space="preserve">Нажмите здесь, чтобы открыть ссылку.</w:t>
         </w:r>
       </w:hyperlink>
+    </w:p>
+    <w:p>
+      <w:pPr>
+        <w:pStyle w:val="BodyText"/>
+      </w:pPr>
+      <w:r>
+        <w:t xml:space="preserve">На виртуальной машине client в браузере выполнен переход по адресу</w:t>
+      </w:r>
+      <w:r>
+        <w:t xml:space="preserve"> </w:t>
+      </w:r>
+      <w:r>
+        <w:rPr>
+          <w:rStyle w:val="VerbatimChar"/>
+        </w:rPr>
+        <w:t xml:space="preserve">https://www.bahis.net</w:t>
+      </w:r>
+      <w:r>
+        <w:t xml:space="preserve">. Произошло автоматическое перенаправление с HTTP на HTTPS. После добавления исключения безопасности отображается содержимое веб-страницы сервера, что подтверждает корректную работу HTTPS-соединения (</w:t>
+      </w:r>
+      <w:r>
+        <w:rPr>
+          <w:b/>
+          <w:bCs/>
+        </w:rPr>
+        <w:t xml:space="preserve">?@fig-4</w:t>
+      </w:r>
       <w:r>
         <w:t xml:space="preserve">).</w:t>
       </w:r>
     </w:p>
-    <w:tbl>
-      <w:tblPr>
-        <w:tblStyle w:val="Table"/>
-        <w:tblW w:type="pct" w:w="5000"/>
-        <w:tblLayout w:type="fixed"/>
-        <w:tblLook w:firstRow="0" w:lastRow="0" w:firstColumn="0" w:lastColumn="0" w:noHBand="0" w:noVBand="0" w:val="0000"/>
-      </w:tblPr>
-      <w:tblGrid>
-        <w:gridCol w:w="7920"/>
-      </w:tblGrid>
-      <w:tr>
-        <w:tc>
-          <w:tcPr/>
-          <w:bookmarkStart w:id="33" w:name="fig-3"/>
-          <w:p>
-            <w:pPr>
-              <w:pStyle w:val="Compact"/>
-              <w:jc w:val="center"/>
-            </w:pPr>
-            <w:r>
-              <w:drawing>
-                <wp:inline>
-                  <wp:extent cx="3733800" cy="2613264"/>
-                  <wp:effectExtent b="0" l="0" r="0" t="0"/>
-                  <wp:docPr descr="" title="" id="31" name="Picture"/>
-                  <a:graphic>
-                    <a:graphicData uri="http://schemas.openxmlformats.org/drawingml/2006/picture">
-                      <pic:pic>
-                        <pic:nvPicPr>
-                          <pic:cNvPr descr="image/3.png" id="32" name="Picture"/>
-                          <pic:cNvPicPr>
-                            <a:picLocks noChangeArrowheads="1" noChangeAspect="1"/>
-                          </pic:cNvPicPr>
-                        </pic:nvPicPr>
-                        <pic:blipFill>
-                          <a:blip r:embed="rId30"/>
-                          <a:stretch>
-                            <a:fillRect/>
-                          </a:stretch>
-                        </pic:blipFill>
-                        <pic:spPr bwMode="auto">
-                          <a:xfrm>
-                            <a:off x="0" y="0"/>
-                            <a:ext cx="3733800" cy="2613264"/>
-                          </a:xfrm>
-                          <a:prstGeom prst="rect">
-                            <a:avLst/>
-                          </a:prstGeom>
-                          <a:noFill/>
-                          <a:ln w="9525">
-                            <a:noFill/>
-                            <a:headEnd/>
-                            <a:tailEnd/>
-                          </a:ln>
-                        </pic:spPr>
-                      </pic:pic>
-                    </a:graphicData>
-                  </a:graphic>
-                </wp:inline>
-              </w:drawing>
-            </w:r>
-          </w:p>
-          <w:p>
-            <w:pPr>
-              <w:jc w:val="center"/>
-            </w:pPr>
-            <w:pPr>
-              <w:jc w:val="start"/>
-              <w:spacing w:before="200"/>
-              <w:pStyle w:val="ImageCaption"/>
-            </w:pPr>
-            <w:r>
-              <w:t xml:space="preserve">Рисунок 3: Настройка firewalld и перезапуск службы httpd</w:t>
-            </w:r>
-          </w:p>
-          <w:bookmarkEnd w:id="33"/>
-        </w:tc>
-      </w:tr>
-    </w:tbl>
     <w:p>
       <w:pPr>
         <w:pStyle w:val="BodyText"/>
       </w:pPr>
-      <w:r>
-        <w:t xml:space="preserve">На виртуальной машине client в браузере выполнен переход по адресу</w:t>
-      </w:r>
-      <w:r>
-        <w:t xml:space="preserve"> </w:t>
-      </w:r>
-      <w:r>
-        <w:rPr>
-          <w:rStyle w:val="VerbatimChar"/>
-        </w:rPr>
-        <w:t xml:space="preserve">https://www.bahis.net</w:t>
-      </w:r>
-      <w:r>
-        <w:t xml:space="preserve">. Произошло автоматическое перенаправление с HTTP на HTTPS. После добавления исключения безопасности отображается содержимое веб-страницы сервера, что подтверждает корректную работу HTTPS-соединения (</w:t>
-      </w:r>
-      <w:hyperlink w:anchor="fig-4">
+      <w:bookmarkStart w:id="40" w:name="fig-4"/>
+      <w:r>
+        <w:drawing>
+          <wp:inline>
+            <wp:extent cx="3733800" cy="2038065"/>
+            <wp:effectExtent b="0" l="0" r="0" t="0"/>
+            <wp:docPr descr="Доступ к веб-серверу по HTTPS в браузере клиента" title="" id="38" name="Picture"/>
+            <a:graphic>
+              <a:graphicData uri="http://schemas.openxmlformats.org/drawingml/2006/picture">
+                <pic:pic>
+                  <pic:nvPicPr>
+                    <pic:cNvPr descr="image/4.png" id="39" name="Picture"/>
+                    <pic:cNvPicPr>
+                      <a:picLocks noChangeArrowheads="1" noChangeAspect="1"/>
+                    </pic:cNvPicPr>
+                  </pic:nvPicPr>
+                  <pic:blipFill>
+                    <a:blip r:embed="rId37"/>
+                    <a:stretch>
+                      <a:fillRect/>
+                    </a:stretch>
+                  </pic:blipFill>
+                  <pic:spPr bwMode="auto">
+                    <a:xfrm>
+                      <a:off x="0" y="0"/>
+                      <a:ext cx="3733800" cy="2038065"/>
+                    </a:xfrm>
+                    <a:prstGeom prst="rect">
+                      <a:avLst/>
+                    </a:prstGeom>
+                    <a:noFill/>
+                    <a:ln w="9525">
+                      <a:noFill/>
+                      <a:headEnd/>
+                      <a:tailEnd/>
+                    </a:ln>
+                  </pic:spPr>
+                </pic:pic>
+              </a:graphicData>
+            </a:graphic>
+          </wp:inline>
+        </w:drawing>
+      </w:r>
+      <w:bookmarkEnd w:id="40"/>
+      <w:r>
+        <w:t xml:space="preserve"> </w:t>
+      </w:r>
+      <w:hyperlink r:id="rId41">
         <w:r>
           <w:rPr>
             <w:rStyle w:val="Hyperlink"/>
           </w:rPr>
-          <w:t xml:space="preserve">рис. 4</w:t>
+          <w:t xml:space="preserve">Нажмите здесь, чтобы открыть ссылку.</w:t>
         </w:r>
       </w:hyperlink>
+    </w:p>
+    <w:bookmarkEnd w:id="42"/>
+    <w:bookmarkStart w:id="58" w:name="X22b182ae2adfbbfeb7e7f1e059d8f9fbe5ab33f"/>
+    <w:p>
+      <w:pPr>
+        <w:pStyle w:val="Heading2"/>
+      </w:pPr>
+      <w:r>
+        <w:t xml:space="preserve">2.2 Конфигурирование HTTP-сервера для работы с PHP</w:t>
+      </w:r>
+    </w:p>
+    <w:p>
+      <w:pPr>
+        <w:pStyle w:val="FirstParagraph"/>
+      </w:pPr>
+      <w:r>
+        <w:t xml:space="preserve">На сервере выполнена установка пакета</w:t>
+      </w:r>
+      <w:r>
+        <w:t xml:space="preserve"> </w:t>
+      </w:r>
+      <w:r>
+        <w:rPr>
+          <w:rStyle w:val="VerbatimChar"/>
+        </w:rPr>
+        <w:t xml:space="preserve">php</w:t>
+      </w:r>
+      <w:r>
+        <w:t xml:space="preserve"> </w:t>
+      </w:r>
+      <w:r>
+        <w:t xml:space="preserve">с использованием менеджера пакетов</w:t>
+      </w:r>
+      <w:r>
+        <w:t xml:space="preserve"> </w:t>
+      </w:r>
+      <w:r>
+        <w:rPr>
+          <w:rStyle w:val="VerbatimChar"/>
+        </w:rPr>
+        <w:t xml:space="preserve">dnf</w:t>
+      </w:r>
+      <w:r>
+        <w:t xml:space="preserve">. В результате были установлены основной пакет PHP версии 8.0.30 и связанные зависимости, необходимые для функционирования PHP-интерпретатора в составе веб-сервера (</w:t>
+      </w:r>
+      <w:r>
+        <w:rPr>
+          <w:b/>
+          <w:bCs/>
+        </w:rPr>
+        <w:t xml:space="preserve">?@fig-5</w:t>
+      </w:r>
       <w:r>
         <w:t xml:space="preserve">).</w:t>
       </w:r>
     </w:p>
-    <w:tbl>
-      <w:tblPr>
-        <w:tblStyle w:val="Table"/>
-        <w:tblW w:type="pct" w:w="5000"/>
-        <w:tblLayout w:type="fixed"/>
-        <w:tblLook w:firstRow="0" w:lastRow="0" w:firstColumn="0" w:lastColumn="0" w:noHBand="0" w:noVBand="0" w:val="0000"/>
-      </w:tblPr>
-      <w:tblGrid>
-        <w:gridCol w:w="7920"/>
-      </w:tblGrid>
-      <w:tr>
-        <w:tc>
-          <w:tcPr/>
-          <w:bookmarkStart w:id="37" w:name="fig-4"/>
-          <w:p>
-            <w:pPr>
-              <w:pStyle w:val="Compact"/>
-              <w:jc w:val="center"/>
-            </w:pPr>
-            <w:r>
-              <w:drawing>
-                <wp:inline>
-                  <wp:extent cx="3733800" cy="2038065"/>
-                  <wp:effectExtent b="0" l="0" r="0" t="0"/>
-                  <wp:docPr descr="" title="" id="35" name="Picture"/>
-                  <a:graphic>
-                    <a:graphicData uri="http://schemas.openxmlformats.org/drawingml/2006/picture">
-                      <pic:pic>
-                        <pic:nvPicPr>
-                          <pic:cNvPr descr="image/4.png" id="36" name="Picture"/>
-                          <pic:cNvPicPr>
-                            <a:picLocks noChangeArrowheads="1" noChangeAspect="1"/>
-                          </pic:cNvPicPr>
-                        </pic:nvPicPr>
-                        <pic:blipFill>
-                          <a:blip r:embed="rId34"/>
-                          <a:stretch>
-                            <a:fillRect/>
-                          </a:stretch>
-                        </pic:blipFill>
-                        <pic:spPr bwMode="auto">
-                          <a:xfrm>
-                            <a:off x="0" y="0"/>
-                            <a:ext cx="3733800" cy="2038065"/>
-                          </a:xfrm>
-                          <a:prstGeom prst="rect">
-                            <a:avLst/>
-                          </a:prstGeom>
-                          <a:noFill/>
-                          <a:ln w="9525">
-                            <a:noFill/>
-                            <a:headEnd/>
-                            <a:tailEnd/>
-                          </a:ln>
-                        </pic:spPr>
-                      </pic:pic>
-                    </a:graphicData>
-                  </a:graphic>
-                </wp:inline>
-              </w:drawing>
-            </w:r>
-          </w:p>
-          <w:p>
-            <w:pPr>
-              <w:jc w:val="center"/>
-            </w:pPr>
-            <w:pPr>
-              <w:jc w:val="start"/>
-              <w:spacing w:before="200"/>
-              <w:pStyle w:val="ImageCaption"/>
-            </w:pPr>
-            <w:r>
-              <w:t xml:space="preserve">Рисунок 4: Доступ к веб-серверу по HTTPS в браузере клиента</w:t>
-            </w:r>
-          </w:p>
-          <w:bookmarkEnd w:id="37"/>
-        </w:tc>
-      </w:tr>
-    </w:tbl>
-    <w:bookmarkEnd w:id="38"/>
-    <w:bookmarkStart w:id="51" w:name="X22b182ae2adfbbfeb7e7f1e059d8f9fbe5ab33f"/>
-    <w:p>
-      <w:pPr>
-        <w:pStyle w:val="Heading2"/>
-      </w:pPr>
-      <w:r>
-        <w:t xml:space="preserve">2.2 Конфигурирование HTTP-сервера для работы с PHP</w:t>
-      </w:r>
-    </w:p>
-    <w:p>
-      <w:pPr>
-        <w:pStyle w:val="FirstParagraph"/>
-      </w:pPr>
-      <w:r>
-        <w:t xml:space="preserve">На сервере выполнена установка пакета</w:t>
-      </w:r>
-      <w:r>
-        <w:t xml:space="preserve"> </w:t>
-      </w:r>
-      <w:r>
-        <w:rPr>
-          <w:rStyle w:val="VerbatimChar"/>
-        </w:rPr>
-        <w:t xml:space="preserve">php</w:t>
-      </w:r>
-      <w:r>
-        <w:t xml:space="preserve"> </w:t>
-      </w:r>
-      <w:r>
-        <w:t xml:space="preserve">с использованием менеджера пакетов</w:t>
-      </w:r>
-      <w:r>
-        <w:t xml:space="preserve"> </w:t>
-      </w:r>
-      <w:r>
-        <w:rPr>
-          <w:rStyle w:val="VerbatimChar"/>
-        </w:rPr>
-        <w:t xml:space="preserve">dnf</w:t>
-      </w:r>
-      <w:r>
-        <w:t xml:space="preserve">. В результате были установлены основной пакет PHP версии 8.0.30 и связанные зависимости, необходимые для функционирования PHP-интерпретатора в составе веб-сервера (</w:t>
-      </w:r>
-      <w:hyperlink w:anchor="fig-5">
+    <w:p>
+      <w:pPr>
+        <w:pStyle w:val="BodyText"/>
+      </w:pPr>
+      <w:bookmarkStart w:id="46" w:name="fig-5"/>
+      <w:r>
+        <w:drawing>
+          <wp:inline>
+            <wp:extent cx="3733800" cy="2477346"/>
+            <wp:effectExtent b="0" l="0" r="0" t="0"/>
+            <wp:docPr descr="Установка пакета PHP с помощью dnf" title="" id="44" name="Picture"/>
+            <a:graphic>
+              <a:graphicData uri="http://schemas.openxmlformats.org/drawingml/2006/picture">
+                <pic:pic>
+                  <pic:nvPicPr>
+                    <pic:cNvPr descr="image/5.png" id="45" name="Picture"/>
+                    <pic:cNvPicPr>
+                      <a:picLocks noChangeArrowheads="1" noChangeAspect="1"/>
+                    </pic:cNvPicPr>
+                  </pic:nvPicPr>
+                  <pic:blipFill>
+                    <a:blip r:embed="rId43"/>
+                    <a:stretch>
+                      <a:fillRect/>
+                    </a:stretch>
+                  </pic:blipFill>
+                  <pic:spPr bwMode="auto">
+                    <a:xfrm>
+                      <a:off x="0" y="0"/>
+                      <a:ext cx="3733800" cy="2477346"/>
+                    </a:xfrm>
+                    <a:prstGeom prst="rect">
+                      <a:avLst/>
+                    </a:prstGeom>
+                    <a:noFill/>
+                    <a:ln w="9525">
+                      <a:noFill/>
+                      <a:headEnd/>
+                      <a:tailEnd/>
+                    </a:ln>
+                  </pic:spPr>
+                </pic:pic>
+              </a:graphicData>
+            </a:graphic>
+          </wp:inline>
+        </w:drawing>
+      </w:r>
+      <w:bookmarkEnd w:id="46"/>
+      <w:r>
+        <w:t xml:space="preserve"> </w:t>
+      </w:r>
+      <w:hyperlink r:id="rId47">
         <w:r>
           <w:rPr>
             <w:rStyle w:val="Hyperlink"/>
           </w:rPr>
-          <w:t xml:space="preserve">рис. 5</w:t>
+          <w:t xml:space="preserve">Нажмите здесь, чтобы открыть ссылку.</w:t>
         </w:r>
       </w:hyperlink>
+    </w:p>
+    <w:p>
+      <w:pPr>
+        <w:pStyle w:val="BodyText"/>
+      </w:pPr>
+      <w:r>
+        <w:t xml:space="preserve">В каталоге</w:t>
+      </w:r>
+      <w:r>
+        <w:t xml:space="preserve"> </w:t>
+      </w:r>
+      <w:r>
+        <w:rPr>
+          <w:rStyle w:val="VerbatimChar"/>
+        </w:rPr>
+        <w:t xml:space="preserve">/var/www/html/www.bahis.net</w:t>
+      </w:r>
+      <w:r>
+        <w:t xml:space="preserve"> </w:t>
+      </w:r>
+      <w:r>
+        <w:t xml:space="preserve">файл</w:t>
+      </w:r>
+      <w:r>
+        <w:t xml:space="preserve"> </w:t>
+      </w:r>
+      <w:r>
+        <w:rPr>
+          <w:rStyle w:val="VerbatimChar"/>
+        </w:rPr>
+        <w:t xml:space="preserve">index.html</w:t>
+      </w:r>
+      <w:r>
+        <w:t xml:space="preserve"> </w:t>
+      </w:r>
+      <w:r>
+        <w:t xml:space="preserve">был удалён и создан файл</w:t>
+      </w:r>
+      <w:r>
+        <w:t xml:space="preserve"> </w:t>
+      </w:r>
+      <w:r>
+        <w:rPr>
+          <w:rStyle w:val="VerbatimChar"/>
+        </w:rPr>
+        <w:t xml:space="preserve">index.php</w:t>
+      </w:r>
+      <w:r>
+        <w:t xml:space="preserve"> </w:t>
+      </w:r>
+      <w:r>
+        <w:t xml:space="preserve">с содержимым</w:t>
+      </w:r>
+      <w:r>
+        <w:t xml:space="preserve"> </w:t>
+      </w:r>
+      <w:r>
+        <w:rPr>
+          <w:rStyle w:val="VerbatimChar"/>
+        </w:rPr>
+        <w:t xml:space="preserve">phpinfo();</w:t>
+      </w:r>
+      <w:r>
+        <w:t xml:space="preserve">, предназначенным для вывода конфигурационной информации PHP. После этого изменён владелец каталога</w:t>
+      </w:r>
+      <w:r>
+        <w:t xml:space="preserve"> </w:t>
+      </w:r>
+      <w:r>
+        <w:rPr>
+          <w:rStyle w:val="VerbatimChar"/>
+        </w:rPr>
+        <w:t xml:space="preserve">/var/www</w:t>
+      </w:r>
+      <w:r>
+        <w:t xml:space="preserve"> </w:t>
+      </w:r>
+      <w:r>
+        <w:t xml:space="preserve">на пользователя и группу</w:t>
+      </w:r>
+      <w:r>
+        <w:t xml:space="preserve"> </w:t>
+      </w:r>
+      <w:r>
+        <w:rPr>
+          <w:rStyle w:val="VerbatimChar"/>
+        </w:rPr>
+        <w:t xml:space="preserve">apache</w:t>
+      </w:r>
+      <w:r>
+        <w:t xml:space="preserve">, восстановлены контексты безопасности SELinux для каталогов</w:t>
+      </w:r>
+      <w:r>
+        <w:t xml:space="preserve"> </w:t>
+      </w:r>
+      <w:r>
+        <w:rPr>
+          <w:rStyle w:val="VerbatimChar"/>
+        </w:rPr>
+        <w:t xml:space="preserve">/etc</w:t>
+      </w:r>
+      <w:r>
+        <w:t xml:space="preserve"> </w:t>
+      </w:r>
+      <w:r>
+        <w:t xml:space="preserve">и</w:t>
+      </w:r>
+      <w:r>
+        <w:t xml:space="preserve"> </w:t>
+      </w:r>
+      <w:r>
+        <w:rPr>
+          <w:rStyle w:val="VerbatimChar"/>
+        </w:rPr>
+        <w:t xml:space="preserve">/var/www</w:t>
+      </w:r>
+      <w:r>
+        <w:t xml:space="preserve">, затем выполнен перезапуск службы</w:t>
+      </w:r>
+      <w:r>
+        <w:t xml:space="preserve"> </w:t>
+      </w:r>
+      <w:r>
+        <w:rPr>
+          <w:rStyle w:val="VerbatimChar"/>
+        </w:rPr>
+        <w:t xml:space="preserve">httpd</w:t>
+      </w:r>
+      <w:r>
+        <w:t xml:space="preserve"> </w:t>
+      </w:r>
+      <w:r>
+        <w:t xml:space="preserve">для применения изменений (</w:t>
+      </w:r>
+      <w:r>
+        <w:rPr>
+          <w:b/>
+          <w:bCs/>
+        </w:rPr>
+        <w:t xml:space="preserve">?@fig-6</w:t>
+      </w:r>
       <w:r>
         <w:t xml:space="preserve">).</w:t>
       </w:r>
     </w:p>
-    <w:tbl>
-      <w:tblPr>
-        <w:tblStyle w:val="Table"/>
-        <w:tblW w:type="pct" w:w="5000"/>
-        <w:tblLayout w:type="fixed"/>
-        <w:tblLook w:firstRow="0" w:lastRow="0" w:firstColumn="0" w:lastColumn="0" w:noHBand="0" w:noVBand="0" w:val="0000"/>
-      </w:tblPr>
-      <w:tblGrid>
-        <w:gridCol w:w="7920"/>
-      </w:tblGrid>
-      <w:tr>
-        <w:tc>
-          <w:tcPr/>
-          <w:bookmarkStart w:id="42" w:name="fig-5"/>
-          <w:p>
-            <w:pPr>
-              <w:pStyle w:val="Compact"/>
-              <w:jc w:val="center"/>
-            </w:pPr>
-            <w:r>
-              <w:drawing>
-                <wp:inline>
-                  <wp:extent cx="3733800" cy="2477346"/>
-                  <wp:effectExtent b="0" l="0" r="0" t="0"/>
-                  <wp:docPr descr="" title="" id="40" name="Picture"/>
-                  <a:graphic>
-                    <a:graphicData uri="http://schemas.openxmlformats.org/drawingml/2006/picture">
-                      <pic:pic>
-                        <pic:nvPicPr>
-                          <pic:cNvPr descr="image/5.png" id="41" name="Picture"/>
-                          <pic:cNvPicPr>
-                            <a:picLocks noChangeArrowheads="1" noChangeAspect="1"/>
-                          </pic:cNvPicPr>
-                        </pic:nvPicPr>
-                        <pic:blipFill>
-                          <a:blip r:embed="rId39"/>
-                          <a:stretch>
-                            <a:fillRect/>
-                          </a:stretch>
-                        </pic:blipFill>
-                        <pic:spPr bwMode="auto">
-                          <a:xfrm>
-                            <a:off x="0" y="0"/>
-                            <a:ext cx="3733800" cy="2477346"/>
-                          </a:xfrm>
-                          <a:prstGeom prst="rect">
-                            <a:avLst/>
-                          </a:prstGeom>
-                          <a:noFill/>
-                          <a:ln w="9525">
-                            <a:noFill/>
-                            <a:headEnd/>
-                            <a:tailEnd/>
-                          </a:ln>
-                        </pic:spPr>
-                      </pic:pic>
-                    </a:graphicData>
-                  </a:graphic>
-                </wp:inline>
-              </w:drawing>
-            </w:r>
-          </w:p>
-          <w:p>
-            <w:pPr>
-              <w:jc w:val="center"/>
-            </w:pPr>
-            <w:pPr>
-              <w:jc w:val="start"/>
-              <w:spacing w:before="200"/>
-              <w:pStyle w:val="ImageCaption"/>
-            </w:pPr>
-            <w:r>
-              <w:t xml:space="preserve">Рисунок 5: Установка пакета PHP с помощью dnf</w:t>
-            </w:r>
-          </w:p>
-          <w:bookmarkEnd w:id="42"/>
-        </w:tc>
-      </w:tr>
-    </w:tbl>
     <w:p>
       <w:pPr>
         <w:pStyle w:val="BodyText"/>
       </w:pPr>
-      <w:r>
-        <w:t xml:space="preserve">В каталоге</w:t>
-      </w:r>
-      <w:r>
-        <w:t xml:space="preserve"> </w:t>
-      </w:r>
-      <w:r>
-        <w:rPr>
-          <w:rStyle w:val="VerbatimChar"/>
-        </w:rPr>
-        <w:t xml:space="preserve">/var/www/html/www.bahis.net</w:t>
-      </w:r>
-      <w:r>
-        <w:t xml:space="preserve"> </w:t>
-      </w:r>
-      <w:r>
-        <w:t xml:space="preserve">файл</w:t>
-      </w:r>
-      <w:r>
-        <w:t xml:space="preserve"> </w:t>
-      </w:r>
-      <w:r>
-        <w:rPr>
-          <w:rStyle w:val="VerbatimChar"/>
-        </w:rPr>
-        <w:t xml:space="preserve">index.html</w:t>
-      </w:r>
-      <w:r>
-        <w:t xml:space="preserve"> </w:t>
-      </w:r>
-      <w:r>
-        <w:t xml:space="preserve">был удалён и создан файл</w:t>
-      </w:r>
-      <w:r>
-        <w:t xml:space="preserve"> </w:t>
-      </w:r>
-      <w:r>
-        <w:rPr>
-          <w:rStyle w:val="VerbatimChar"/>
-        </w:rPr>
-        <w:t xml:space="preserve">index.php</w:t>
-      </w:r>
-      <w:r>
-        <w:t xml:space="preserve"> </w:t>
-      </w:r>
-      <w:r>
-        <w:t xml:space="preserve">с содержимым</w:t>
-      </w:r>
-      <w:r>
-        <w:t xml:space="preserve"> </w:t>
-      </w:r>
-      <w:r>
-        <w:rPr>
-          <w:rStyle w:val="VerbatimChar"/>
-        </w:rPr>
-        <w:t xml:space="preserve">phpinfo();</w:t>
-      </w:r>
-      <w:r>
-        <w:t xml:space="preserve">, предназначенным для вывода конфигурационной информации PHP. После этого изменён владелец каталога</w:t>
-      </w:r>
-      <w:r>
-        <w:t xml:space="preserve"> </w:t>
-      </w:r>
-      <w:r>
-        <w:rPr>
-          <w:rStyle w:val="VerbatimChar"/>
-        </w:rPr>
-        <w:t xml:space="preserve">/var/www</w:t>
-      </w:r>
-      <w:r>
-        <w:t xml:space="preserve"> </w:t>
-      </w:r>
-      <w:r>
-        <w:t xml:space="preserve">на пользователя и группу</w:t>
-      </w:r>
-      <w:r>
-        <w:t xml:space="preserve"> </w:t>
-      </w:r>
-      <w:r>
-        <w:rPr>
-          <w:rStyle w:val="VerbatimChar"/>
-        </w:rPr>
-        <w:t xml:space="preserve">apache</w:t>
-      </w:r>
-      <w:r>
-        <w:t xml:space="preserve">, восстановлены контексты безопасности SELinux для каталогов</w:t>
-      </w:r>
-      <w:r>
-        <w:t xml:space="preserve"> </w:t>
-      </w:r>
-      <w:r>
-        <w:rPr>
-          <w:rStyle w:val="VerbatimChar"/>
-        </w:rPr>
-        <w:t xml:space="preserve">/etc</w:t>
-      </w:r>
-      <w:r>
-        <w:t xml:space="preserve"> </w:t>
-      </w:r>
-      <w:r>
-        <w:t xml:space="preserve">и</w:t>
-      </w:r>
-      <w:r>
-        <w:t xml:space="preserve"> </w:t>
-      </w:r>
-      <w:r>
-        <w:rPr>
-          <w:rStyle w:val="VerbatimChar"/>
-        </w:rPr>
-        <w:t xml:space="preserve">/var/www</w:t>
-      </w:r>
-      <w:r>
-        <w:t xml:space="preserve">, затем выполнен перезапуск службы</w:t>
-      </w:r>
-      <w:r>
-        <w:t xml:space="preserve"> </w:t>
-      </w:r>
-      <w:r>
-        <w:rPr>
-          <w:rStyle w:val="VerbatimChar"/>
-        </w:rPr>
-        <w:t xml:space="preserve">httpd</w:t>
-      </w:r>
-      <w:r>
-        <w:t xml:space="preserve"> </w:t>
-      </w:r>
-      <w:r>
-        <w:t xml:space="preserve">для применения изменений (</w:t>
-      </w:r>
-      <w:hyperlink w:anchor="fig-6">
+      <w:bookmarkStart w:id="51" w:name="fig-6"/>
+      <w:r>
+        <w:drawing>
+          <wp:inline>
+            <wp:extent cx="3733800" cy="2271722"/>
+            <wp:effectExtent b="0" l="0" r="0" t="0"/>
+            <wp:docPr descr="Создание index.php, настройка прав доступа и перезапуск httpd" title="" id="49" name="Picture"/>
+            <a:graphic>
+              <a:graphicData uri="http://schemas.openxmlformats.org/drawingml/2006/picture">
+                <pic:pic>
+                  <pic:nvPicPr>
+                    <pic:cNvPr descr="image/6.png" id="50" name="Picture"/>
+                    <pic:cNvPicPr>
+                      <a:picLocks noChangeArrowheads="1" noChangeAspect="1"/>
+                    </pic:cNvPicPr>
+                  </pic:nvPicPr>
+                  <pic:blipFill>
+                    <a:blip r:embed="rId48"/>
+                    <a:stretch>
+                      <a:fillRect/>
+                    </a:stretch>
+                  </pic:blipFill>
+                  <pic:spPr bwMode="auto">
+                    <a:xfrm>
+                      <a:off x="0" y="0"/>
+                      <a:ext cx="3733800" cy="2271722"/>
+                    </a:xfrm>
+                    <a:prstGeom prst="rect">
+                      <a:avLst/>
+                    </a:prstGeom>
+                    <a:noFill/>
+                    <a:ln w="9525">
+                      <a:noFill/>
+                      <a:headEnd/>
+                      <a:tailEnd/>
+                    </a:ln>
+                  </pic:spPr>
+                </pic:pic>
+              </a:graphicData>
+            </a:graphic>
+          </wp:inline>
+        </w:drawing>
+      </w:r>
+      <w:bookmarkEnd w:id="51"/>
+      <w:r>
+        <w:t xml:space="preserve"> </w:t>
+      </w:r>
+      <w:hyperlink r:id="rId52">
         <w:r>
           <w:rPr>
             <w:rStyle w:val="Hyperlink"/>
           </w:rPr>
-          <w:t xml:space="preserve">рис. 6</w:t>
+          <w:t xml:space="preserve">Нажмите здесь, чтобы открыть ссылку.</w:t>
         </w:r>
       </w:hyperlink>
+    </w:p>
+    <w:p>
+      <w:pPr>
+        <w:pStyle w:val="BodyText"/>
+      </w:pPr>
+      <w:r>
+        <w:t xml:space="preserve">На виртуальной машине client в браузере открыт адрес</w:t>
+      </w:r>
+      <w:r>
+        <w:t xml:space="preserve"> </w:t>
+      </w:r>
+      <w:r>
+        <w:rPr>
+          <w:rStyle w:val="VerbatimChar"/>
+        </w:rPr>
+        <w:t xml:space="preserve">www.user.net</w:t>
+      </w:r>
+      <w:r>
+        <w:t xml:space="preserve">. Отображена страница</w:t>
+      </w:r>
+      <w:r>
+        <w:t xml:space="preserve"> </w:t>
+      </w:r>
+      <w:r>
+        <w:rPr>
+          <w:rStyle w:val="VerbatimChar"/>
+        </w:rPr>
+        <w:t xml:space="preserve">phpinfo()</w:t>
+      </w:r>
+      <w:r>
+        <w:t xml:space="preserve">, содержащая сведения о версии PHP (8.0.30), параметрах сборки и загруженных модулях, что подтверждает корректную интеграцию PHP с HTTP-сервером (</w:t>
+      </w:r>
+      <w:r>
+        <w:rPr>
+          <w:b/>
+          <w:bCs/>
+        </w:rPr>
+        <w:t xml:space="preserve">?@fig-7</w:t>
+      </w:r>
       <w:r>
         <w:t xml:space="preserve">).</w:t>
       </w:r>
     </w:p>
-    <w:tbl>
-      <w:tblPr>
-        <w:tblStyle w:val="Table"/>
-        <w:tblW w:type="pct" w:w="5000"/>
-        <w:tblLayout w:type="fixed"/>
-        <w:tblLook w:firstRow="0" w:lastRow="0" w:firstColumn="0" w:lastColumn="0" w:noHBand="0" w:noVBand="0" w:val="0000"/>
-      </w:tblPr>
-      <w:tblGrid>
-        <w:gridCol w:w="7920"/>
-      </w:tblGrid>
-      <w:tr>
-        <w:tc>
-          <w:tcPr/>
-          <w:bookmarkStart w:id="46" w:name="fig-6"/>
-          <w:p>
-            <w:pPr>
-              <w:pStyle w:val="Compact"/>
-              <w:jc w:val="center"/>
-            </w:pPr>
-            <w:r>
-              <w:drawing>
-                <wp:inline>
-                  <wp:extent cx="3733800" cy="2271722"/>
-                  <wp:effectExtent b="0" l="0" r="0" t="0"/>
-                  <wp:docPr descr="" title="" id="44" name="Picture"/>
-                  <a:graphic>
-                    <a:graphicData uri="http://schemas.openxmlformats.org/drawingml/2006/picture">
-                      <pic:pic>
-                        <pic:nvPicPr>
-                          <pic:cNvPr descr="image/6.png" id="45" name="Picture"/>
-                          <pic:cNvPicPr>
-                            <a:picLocks noChangeArrowheads="1" noChangeAspect="1"/>
-                          </pic:cNvPicPr>
-                        </pic:nvPicPr>
-                        <pic:blipFill>
-                          <a:blip r:embed="rId43"/>
-                          <a:stretch>
-                            <a:fillRect/>
-                          </a:stretch>
-                        </pic:blipFill>
-                        <pic:spPr bwMode="auto">
-                          <a:xfrm>
-                            <a:off x="0" y="0"/>
-                            <a:ext cx="3733800" cy="2271722"/>
-                          </a:xfrm>
-                          <a:prstGeom prst="rect">
-                            <a:avLst/>
-                          </a:prstGeom>
-                          <a:noFill/>
-                          <a:ln w="9525">
-                            <a:noFill/>
-                            <a:headEnd/>
-                            <a:tailEnd/>
-                          </a:ln>
-                        </pic:spPr>
-                      </pic:pic>
-                    </a:graphicData>
-                  </a:graphic>
-                </wp:inline>
-              </w:drawing>
-            </w:r>
-          </w:p>
-          <w:p>
-            <w:pPr>
-              <w:jc w:val="center"/>
-            </w:pPr>
-            <w:pPr>
-              <w:jc w:val="start"/>
-              <w:spacing w:before="200"/>
-              <w:pStyle w:val="ImageCaption"/>
-            </w:pPr>
-            <w:r>
-              <w:t xml:space="preserve">Рисунок 6: Создание index.php, настройка прав доступа и перезапуск httpd</w:t>
-            </w:r>
-          </w:p>
-          <w:bookmarkEnd w:id="46"/>
-        </w:tc>
-      </w:tr>
-    </w:tbl>
     <w:p>
       <w:pPr>
         <w:pStyle w:val="BodyText"/>
       </w:pPr>
-      <w:r>
-        <w:t xml:space="preserve">На виртуальной машине client в браузере открыт адрес</w:t>
-      </w:r>
-      <w:r>
-        <w:t xml:space="preserve"> </w:t>
-      </w:r>
-      <w:r>
-        <w:rPr>
-          <w:rStyle w:val="VerbatimChar"/>
-        </w:rPr>
-        <w:t xml:space="preserve">www.bahis.net</w:t>
-      </w:r>
-      <w:r>
-        <w:t xml:space="preserve">. Отображена страница</w:t>
-      </w:r>
-      <w:r>
-        <w:t xml:space="preserve"> </w:t>
-      </w:r>
-      <w:r>
-        <w:rPr>
-          <w:rStyle w:val="VerbatimChar"/>
-        </w:rPr>
-        <w:t xml:space="preserve">phpinfo()</w:t>
-      </w:r>
-      <w:r>
-        <w:t xml:space="preserve">, содержащая сведения о версии PHP (8.0.30), параметрах сборки и загруженных модулях, что подтверждает корректную интеграцию PHP с HTTP-сервером (</w:t>
-      </w:r>
-      <w:hyperlink w:anchor="fig-7">
+      <w:bookmarkStart w:id="56" w:name="fig-7"/>
+      <w:r>
+        <w:drawing>
+          <wp:inline>
+            <wp:extent cx="3733800" cy="3045040"/>
+            <wp:effectExtent b="0" l="0" r="0" t="0"/>
+            <wp:docPr descr="Отображение страницы phpinfo() в браузере клиента" title="" id="54" name="Picture"/>
+            <a:graphic>
+              <a:graphicData uri="http://schemas.openxmlformats.org/drawingml/2006/picture">
+                <pic:pic>
+                  <pic:nvPicPr>
+                    <pic:cNvPr descr="image/7.png" id="55" name="Picture"/>
+                    <pic:cNvPicPr>
+                      <a:picLocks noChangeArrowheads="1" noChangeAspect="1"/>
+                    </pic:cNvPicPr>
+                  </pic:nvPicPr>
+                  <pic:blipFill>
+                    <a:blip r:embed="rId53"/>
+                    <a:stretch>
+                      <a:fillRect/>
+                    </a:stretch>
+                  </pic:blipFill>
+                  <pic:spPr bwMode="auto">
+                    <a:xfrm>
+                      <a:off x="0" y="0"/>
+                      <a:ext cx="3733800" cy="3045040"/>
+                    </a:xfrm>
+                    <a:prstGeom prst="rect">
+                      <a:avLst/>
+                    </a:prstGeom>
+                    <a:noFill/>
+                    <a:ln w="9525">
+                      <a:noFill/>
+                      <a:headEnd/>
+                      <a:tailEnd/>
+                    </a:ln>
+                  </pic:spPr>
+                </pic:pic>
+              </a:graphicData>
+            </a:graphic>
+          </wp:inline>
+        </w:drawing>
+      </w:r>
+      <w:bookmarkEnd w:id="56"/>
+      <w:r>
+        <w:t xml:space="preserve"> </w:t>
+      </w:r>
+      <w:hyperlink r:id="rId57">
         <w:r>
           <w:rPr>
             <w:rStyle w:val="Hyperlink"/>
           </w:rPr>
-          <w:t xml:space="preserve">рис. 7</w:t>
+          <w:t xml:space="preserve">Нажмите здесь, чтобы открыть ссылку.</w:t>
         </w:r>
       </w:hyperlink>
+    </w:p>
+    <w:bookmarkEnd w:id="58"/>
+    <w:bookmarkStart w:id="69" w:name="Xd636270ea8e9bb71f498bde6a96fb3a56434bd8"/>
+    <w:p>
+      <w:pPr>
+        <w:pStyle w:val="Heading2"/>
+      </w:pPr>
+      <w:r>
+        <w:t xml:space="preserve">2.3 Внесение изменений в настройки внутреннего окружения виртуальной машины</w:t>
+      </w:r>
+    </w:p>
+    <w:p>
+      <w:pPr>
+        <w:pStyle w:val="FirstParagraph"/>
+      </w:pPr>
+      <w:r>
+        <w:t xml:space="preserve">На виртуальной машине server выполнено копирование конфигурационных файлов веб-сервера и веб-контента в каталог внутреннего окружения</w:t>
+      </w:r>
+      <w:r>
+        <w:t xml:space="preserve"> </w:t>
+      </w:r>
+      <w:r>
+        <w:rPr>
+          <w:rStyle w:val="VerbatimChar"/>
+        </w:rPr>
+        <w:t xml:space="preserve">/vagrant/provision/server/http</w:t>
+      </w:r>
+      <w:r>
+        <w:t xml:space="preserve">. Скопированы файлы из</w:t>
+      </w:r>
+      <w:r>
+        <w:t xml:space="preserve"> </w:t>
+      </w:r>
+      <w:r>
+        <w:rPr>
+          <w:rStyle w:val="VerbatimChar"/>
+        </w:rPr>
+        <w:t xml:space="preserve">/etc/httpd/conf.d</w:t>
+      </w:r>
+      <w:r>
+        <w:t xml:space="preserve"> </w:t>
+      </w:r>
+      <w:r>
+        <w:t xml:space="preserve">и</w:t>
+      </w:r>
+      <w:r>
+        <w:t xml:space="preserve"> </w:t>
+      </w:r>
+      <w:r>
+        <w:rPr>
+          <w:rStyle w:val="VerbatimChar"/>
+        </w:rPr>
+        <w:t xml:space="preserve">/var/www/html</w:t>
+      </w:r>
+      <w:r>
+        <w:t xml:space="preserve">, созданы каталоги для хранения ключей и сертификатов</w:t>
+      </w:r>
+      <w:r>
+        <w:t xml:space="preserve"> </w:t>
+      </w:r>
+      <w:r>
+        <w:rPr>
+          <w:rStyle w:val="VerbatimChar"/>
+        </w:rPr>
+        <w:t xml:space="preserve">/etc/pki/tls/private</w:t>
+      </w:r>
+      <w:r>
+        <w:t xml:space="preserve"> </w:t>
+      </w:r>
+      <w:r>
+        <w:t xml:space="preserve">и</w:t>
+      </w:r>
+      <w:r>
+        <w:t xml:space="preserve"> </w:t>
+      </w:r>
+      <w:r>
+        <w:rPr>
+          <w:rStyle w:val="VerbatimChar"/>
+        </w:rPr>
+        <w:t xml:space="preserve">/etc/pki/tls/certs</w:t>
+      </w:r>
+      <w:r>
+        <w:t xml:space="preserve"> </w:t>
+      </w:r>
+      <w:r>
+        <w:t xml:space="preserve">внутри структуры provision, после чего в них помещены файлы</w:t>
+      </w:r>
+      <w:r>
+        <w:t xml:space="preserve"> </w:t>
+      </w:r>
+      <w:r>
+        <w:rPr>
+          <w:rStyle w:val="VerbatimChar"/>
+        </w:rPr>
+        <w:t xml:space="preserve">www.bahis.net.key</w:t>
+      </w:r>
+      <w:r>
+        <w:t xml:space="preserve"> </w:t>
+      </w:r>
+      <w:r>
+        <w:t xml:space="preserve">и</w:t>
+      </w:r>
+      <w:r>
+        <w:t xml:space="preserve"> </w:t>
+      </w:r>
+      <w:r>
+        <w:rPr>
+          <w:rStyle w:val="VerbatimChar"/>
+        </w:rPr>
+        <w:t xml:space="preserve">www.bahis.net.crt</w:t>
+      </w:r>
+      <w:r>
+        <w:t xml:space="preserve"> </w:t>
+      </w:r>
+      <w:r>
+        <w:t xml:space="preserve">(</w:t>
+      </w:r>
+      <w:r>
+        <w:rPr>
+          <w:b/>
+          <w:bCs/>
+        </w:rPr>
+        <w:t xml:space="preserve">?@fig-8</w:t>
+      </w:r>
       <w:r>
         <w:t xml:space="preserve">).</w:t>
       </w:r>
     </w:p>
-    <w:tbl>
-      <w:tblPr>
-        <w:tblStyle w:val="Table"/>
-        <w:tblW w:type="pct" w:w="5000"/>
-        <w:tblLayout w:type="fixed"/>
-        <w:tblLook w:firstRow="0" w:lastRow="0" w:firstColumn="0" w:lastColumn="0" w:noHBand="0" w:noVBand="0" w:val="0000"/>
-      </w:tblPr>
-      <w:tblGrid>
-        <w:gridCol w:w="7920"/>
-      </w:tblGrid>
-      <w:tr>
-        <w:tc>
-          <w:tcPr/>
-          <w:bookmarkStart w:id="50" w:name="fig-7"/>
-          <w:p>
-            <w:pPr>
-              <w:pStyle w:val="Compact"/>
-              <w:jc w:val="center"/>
-            </w:pPr>
-            <w:r>
-              <w:drawing>
-                <wp:inline>
-                  <wp:extent cx="3733800" cy="3045040"/>
-                  <wp:effectExtent b="0" l="0" r="0" t="0"/>
-                  <wp:docPr descr="" title="" id="48" name="Picture"/>
-                  <a:graphic>
-                    <a:graphicData uri="http://schemas.openxmlformats.org/drawingml/2006/picture">
-                      <pic:pic>
-                        <pic:nvPicPr>
-                          <pic:cNvPr descr="image/7.png" id="49" name="Picture"/>
-                          <pic:cNvPicPr>
-                            <a:picLocks noChangeArrowheads="1" noChangeAspect="1"/>
-                          </pic:cNvPicPr>
-                        </pic:nvPicPr>
-                        <pic:blipFill>
-                          <a:blip r:embed="rId47"/>
-                          <a:stretch>
-                            <a:fillRect/>
-                          </a:stretch>
-                        </pic:blipFill>
-                        <pic:spPr bwMode="auto">
-                          <a:xfrm>
-                            <a:off x="0" y="0"/>
-                            <a:ext cx="3733800" cy="3045040"/>
-                          </a:xfrm>
-                          <a:prstGeom prst="rect">
-                            <a:avLst/>
-                          </a:prstGeom>
-                          <a:noFill/>
-                          <a:ln w="9525">
-                            <a:noFill/>
-                            <a:headEnd/>
-                            <a:tailEnd/>
-                          </a:ln>
-                        </pic:spPr>
-                      </pic:pic>
-                    </a:graphicData>
-                  </a:graphic>
-                </wp:inline>
-              </w:drawing>
-            </w:r>
-          </w:p>
-          <w:p>
-            <w:pPr>
-              <w:jc w:val="center"/>
-            </w:pPr>
-            <w:pPr>
-              <w:jc w:val="start"/>
-              <w:spacing w:before="200"/>
-              <w:pStyle w:val="ImageCaption"/>
-            </w:pPr>
-            <w:r>
-              <w:t xml:space="preserve">Рисунок 7: Отображение страницы phpinfo() в браузере клиента</w:t>
-            </w:r>
-          </w:p>
-          <w:bookmarkEnd w:id="50"/>
-        </w:tc>
-      </w:tr>
-    </w:tbl>
-    <w:bookmarkEnd w:id="51"/>
-    <w:bookmarkStart w:id="60" w:name="Xd636270ea8e9bb71f498bde6a96fb3a56434bd8"/>
-    <w:p>
-      <w:pPr>
-        <w:pStyle w:val="Heading2"/>
-      </w:pPr>
-      <w:r>
-        <w:t xml:space="preserve">2.3 Внесение изменений в настройки внутреннего окружения виртуальной машины</w:t>
-      </w:r>
-    </w:p>
-    <w:p>
-      <w:pPr>
-        <w:pStyle w:val="FirstParagraph"/>
-      </w:pPr>
-      <w:r>
-        <w:t xml:space="preserve">На виртуальной машине server выполнено копирование конфигурационных файлов веб-сервера и веб-контента в каталог внутреннего окружения</w:t>
-      </w:r>
-      <w:r>
-        <w:t xml:space="preserve"> </w:t>
-      </w:r>
-      <w:r>
-        <w:rPr>
-          <w:rStyle w:val="VerbatimChar"/>
-        </w:rPr>
-        <w:t xml:space="preserve">/vagrant/provision/server/http</w:t>
-      </w:r>
-      <w:r>
-        <w:t xml:space="preserve">. Скопированы файлы из</w:t>
-      </w:r>
-      <w:r>
-        <w:t xml:space="preserve"> </w:t>
-      </w:r>
-      <w:r>
-        <w:rPr>
-          <w:rStyle w:val="VerbatimChar"/>
-        </w:rPr>
-        <w:t xml:space="preserve">/etc/httpd/conf.d</w:t>
-      </w:r>
-      <w:r>
-        <w:t xml:space="preserve"> </w:t>
-      </w:r>
-      <w:r>
-        <w:t xml:space="preserve">и</w:t>
-      </w:r>
-      <w:r>
-        <w:t xml:space="preserve"> </w:t>
-      </w:r>
-      <w:r>
-        <w:rPr>
-          <w:rStyle w:val="VerbatimChar"/>
-        </w:rPr>
-        <w:t xml:space="preserve">/var/www/html</w:t>
-      </w:r>
-      <w:r>
-        <w:t xml:space="preserve">, созданы каталоги для хранения ключей и сертификатов</w:t>
-      </w:r>
-      <w:r>
-        <w:t xml:space="preserve"> </w:t>
-      </w:r>
-      <w:r>
-        <w:rPr>
-          <w:rStyle w:val="VerbatimChar"/>
-        </w:rPr>
-        <w:t xml:space="preserve">/etc/pki/tls/private</w:t>
-      </w:r>
-      <w:r>
-        <w:t xml:space="preserve"> </w:t>
-      </w:r>
-      <w:r>
-        <w:t xml:space="preserve">и</w:t>
-      </w:r>
-      <w:r>
-        <w:t xml:space="preserve"> </w:t>
-      </w:r>
-      <w:r>
-        <w:rPr>
-          <w:rStyle w:val="VerbatimChar"/>
-        </w:rPr>
-        <w:t xml:space="preserve">/etc/pki/tls/certs</w:t>
-      </w:r>
-      <w:r>
-        <w:t xml:space="preserve"> </w:t>
-      </w:r>
-      <w:r>
-        <w:t xml:space="preserve">внутри структуры provision, после чего в них помещены файлы</w:t>
-      </w:r>
-      <w:r>
-        <w:t xml:space="preserve"> </w:t>
-      </w:r>
-      <w:r>
-        <w:rPr>
-          <w:rStyle w:val="VerbatimChar"/>
-        </w:rPr>
-        <w:t xml:space="preserve">www.bahis.net.key</w:t>
-      </w:r>
-      <w:r>
-        <w:t xml:space="preserve"> </w:t>
-      </w:r>
-      <w:r>
-        <w:t xml:space="preserve">и</w:t>
-      </w:r>
-      <w:r>
-        <w:t xml:space="preserve"> </w:t>
-      </w:r>
-      <w:r>
-        <w:rPr>
-          <w:rStyle w:val="VerbatimChar"/>
-        </w:rPr>
-        <w:t xml:space="preserve">www.bahis.net.crt</w:t>
-      </w:r>
-      <w:r>
-        <w:t xml:space="preserve"> </w:t>
-      </w:r>
-      <w:r>
-        <w:t xml:space="preserve">(</w:t>
-      </w:r>
-      <w:hyperlink w:anchor="fig-8">
+    <w:p>
+      <w:pPr>
+        <w:pStyle w:val="BodyText"/>
+      </w:pPr>
+      <w:bookmarkStart w:id="62" w:name="fig-8"/>
+      <w:r>
+        <w:drawing>
+          <wp:inline>
+            <wp:extent cx="3733800" cy="1478377"/>
+            <wp:effectExtent b="0" l="0" r="0" t="0"/>
+            <wp:docPr descr="Копирование конфигурации HTTP и SSL в каталог provision" title="" id="60" name="Picture"/>
+            <a:graphic>
+              <a:graphicData uri="http://schemas.openxmlformats.org/drawingml/2006/picture">
+                <pic:pic>
+                  <pic:nvPicPr>
+                    <pic:cNvPr descr="image/8.png" id="61" name="Picture"/>
+                    <pic:cNvPicPr>
+                      <a:picLocks noChangeArrowheads="1" noChangeAspect="1"/>
+                    </pic:cNvPicPr>
+                  </pic:nvPicPr>
+                  <pic:blipFill>
+                    <a:blip r:embed="rId59"/>
+                    <a:stretch>
+                      <a:fillRect/>
+                    </a:stretch>
+                  </pic:blipFill>
+                  <pic:spPr bwMode="auto">
+                    <a:xfrm>
+                      <a:off x="0" y="0"/>
+                      <a:ext cx="3733800" cy="1478377"/>
+                    </a:xfrm>
+                    <a:prstGeom prst="rect">
+                      <a:avLst/>
+                    </a:prstGeom>
+                    <a:noFill/>
+                    <a:ln w="9525">
+                      <a:noFill/>
+                      <a:headEnd/>
+                      <a:tailEnd/>
+                    </a:ln>
+                  </pic:spPr>
+                </pic:pic>
+              </a:graphicData>
+            </a:graphic>
+          </wp:inline>
+        </w:drawing>
+      </w:r>
+      <w:bookmarkEnd w:id="62"/>
+      <w:r>
+        <w:t xml:space="preserve"> </w:t>
+      </w:r>
+      <w:hyperlink r:id="rId63">
         <w:r>
           <w:rPr>
             <w:rStyle w:val="Hyperlink"/>
           </w:rPr>
-          <w:t xml:space="preserve">рис. 8</w:t>
+          <w:t xml:space="preserve">Нажмите здесь, чтобы открыть ссылку.</w:t>
         </w:r>
       </w:hyperlink>
+    </w:p>
+    <w:p>
+      <w:pPr>
+        <w:pStyle w:val="BodyText"/>
+      </w:pPr>
+      <w:r>
+        <w:t xml:space="preserve">Далее в скрипт</w:t>
+      </w:r>
+      <w:r>
+        <w:t xml:space="preserve"> </w:t>
+      </w:r>
+      <w:r>
+        <w:rPr>
+          <w:rStyle w:val="VerbatimChar"/>
+        </w:rPr>
+        <w:t xml:space="preserve">/vagrant/provision/server/http.sh</w:t>
+      </w:r>
+      <w:r>
+        <w:t xml:space="preserve"> </w:t>
+      </w:r>
+      <w:r>
+        <w:t xml:space="preserve">внесены изменения: добавлена установка пакета</w:t>
+      </w:r>
+      <w:r>
+        <w:t xml:space="preserve"> </w:t>
+      </w:r>
+      <w:r>
+        <w:rPr>
+          <w:rStyle w:val="VerbatimChar"/>
+        </w:rPr>
+        <w:t xml:space="preserve">php</w:t>
+      </w:r>
+      <w:r>
+        <w:t xml:space="preserve">, реализовано копирование конфигурационных файлов в системные каталоги</w:t>
+      </w:r>
+      <w:r>
+        <w:t xml:space="preserve"> </w:t>
+      </w:r>
+      <w:r>
+        <w:rPr>
+          <w:rStyle w:val="VerbatimChar"/>
+        </w:rPr>
+        <w:t xml:space="preserve">/etc/httpd</w:t>
+      </w:r>
+      <w:r>
+        <w:t xml:space="preserve"> </w:t>
+      </w:r>
+      <w:r>
+        <w:t xml:space="preserve">и</w:t>
+      </w:r>
+      <w:r>
+        <w:t xml:space="preserve"> </w:t>
+      </w:r>
+      <w:r>
+        <w:rPr>
+          <w:rStyle w:val="VerbatimChar"/>
+        </w:rPr>
+        <w:t xml:space="preserve">/var/www</w:t>
+      </w:r>
+      <w:r>
+        <w:t xml:space="preserve">, выполнена корректировка владельца каталога</w:t>
+      </w:r>
+      <w:r>
+        <w:t xml:space="preserve"> </w:t>
+      </w:r>
+      <w:r>
+        <w:rPr>
+          <w:rStyle w:val="VerbatimChar"/>
+        </w:rPr>
+        <w:t xml:space="preserve">/var/www</w:t>
+      </w:r>
+      <w:r>
+        <w:t xml:space="preserve">, восстановление контекстов SELinux и добавлены правила межсетевого экрана для сервисов</w:t>
+      </w:r>
+      <w:r>
+        <w:t xml:space="preserve"> </w:t>
+      </w:r>
+      <w:r>
+        <w:rPr>
+          <w:rStyle w:val="VerbatimChar"/>
+        </w:rPr>
+        <w:t xml:space="preserve">http</w:t>
+      </w:r>
+      <w:r>
+        <w:t xml:space="preserve"> </w:t>
+      </w:r>
+      <w:r>
+        <w:t xml:space="preserve">и</w:t>
+      </w:r>
+      <w:r>
+        <w:t xml:space="preserve"> </w:t>
+      </w:r>
+      <w:r>
+        <w:rPr>
+          <w:rStyle w:val="VerbatimChar"/>
+        </w:rPr>
+        <w:t xml:space="preserve">https</w:t>
+      </w:r>
+      <w:r>
+        <w:t xml:space="preserve"> </w:t>
+      </w:r>
+      <w:r>
+        <w:t xml:space="preserve">с постоянным сохранением. В завершение настроено включение и запуск службы</w:t>
+      </w:r>
+      <w:r>
+        <w:t xml:space="preserve"> </w:t>
+      </w:r>
+      <w:r>
+        <w:rPr>
+          <w:rStyle w:val="VerbatimChar"/>
+        </w:rPr>
+        <w:t xml:space="preserve">httpd</w:t>
+      </w:r>
+      <w:r>
+        <w:t xml:space="preserve"> </w:t>
+      </w:r>
+      <w:r>
+        <w:t xml:space="preserve">(</w:t>
+      </w:r>
+      <w:r>
+        <w:rPr>
+          <w:b/>
+          <w:bCs/>
+        </w:rPr>
+        <w:t xml:space="preserve">?@fig-9</w:t>
+      </w:r>
       <w:r>
         <w:t xml:space="preserve">).</w:t>
       </w:r>
     </w:p>
-    <w:tbl>
-      <w:tblPr>
-        <w:tblStyle w:val="Table"/>
-        <w:tblW w:type="pct" w:w="5000"/>
-        <w:tblLayout w:type="fixed"/>
-        <w:tblLook w:firstRow="0" w:lastRow="0" w:firstColumn="0" w:lastColumn="0" w:noHBand="0" w:noVBand="0" w:val="0000"/>
-      </w:tblPr>
-      <w:tblGrid>
-        <w:gridCol w:w="7920"/>
-      </w:tblGrid>
-      <w:tr>
-        <w:tc>
-          <w:tcPr/>
-          <w:bookmarkStart w:id="55" w:name="fig-8"/>
-          <w:p>
-            <w:pPr>
-              <w:pStyle w:val="Compact"/>
-              <w:jc w:val="center"/>
-            </w:pPr>
-            <w:r>
-              <w:drawing>
-                <wp:inline>
-                  <wp:extent cx="3733800" cy="1478377"/>
-                  <wp:effectExtent b="0" l="0" r="0" t="0"/>
-                  <wp:docPr descr="" title="" id="53" name="Picture"/>
-                  <a:graphic>
-                    <a:graphicData uri="http://schemas.openxmlformats.org/drawingml/2006/picture">
-                      <pic:pic>
-                        <pic:nvPicPr>
-                          <pic:cNvPr descr="image/8.png" id="54" name="Picture"/>
-                          <pic:cNvPicPr>
-                            <a:picLocks noChangeArrowheads="1" noChangeAspect="1"/>
-                          </pic:cNvPicPr>
-                        </pic:nvPicPr>
-                        <pic:blipFill>
-                          <a:blip r:embed="rId52"/>
-                          <a:stretch>
-                            <a:fillRect/>
-                          </a:stretch>
-                        </pic:blipFill>
-                        <pic:spPr bwMode="auto">
-                          <a:xfrm>
-                            <a:off x="0" y="0"/>
-                            <a:ext cx="3733800" cy="1478377"/>
-                          </a:xfrm>
-                          <a:prstGeom prst="rect">
-                            <a:avLst/>
-                          </a:prstGeom>
-                          <a:noFill/>
-                          <a:ln w="9525">
-                            <a:noFill/>
-                            <a:headEnd/>
-                            <a:tailEnd/>
-                          </a:ln>
-                        </pic:spPr>
-                      </pic:pic>
-                    </a:graphicData>
-                  </a:graphic>
-                </wp:inline>
-              </w:drawing>
-            </w:r>
-          </w:p>
-          <w:p>
-            <w:pPr>
-              <w:jc w:val="center"/>
-            </w:pPr>
-            <w:pPr>
-              <w:jc w:val="start"/>
-              <w:spacing w:before="200"/>
-              <w:pStyle w:val="ImageCaption"/>
-            </w:pPr>
-            <w:r>
-              <w:t xml:space="preserve">Рисунок 8: Копирование конфигурации HTTP и SSL в каталог provision</w:t>
-            </w:r>
-          </w:p>
-          <w:bookmarkEnd w:id="55"/>
-        </w:tc>
-      </w:tr>
-    </w:tbl>
     <w:p>
       <w:pPr>
         <w:pStyle w:val="BodyText"/>
       </w:pPr>
-      <w:r>
-        <w:t xml:space="preserve">Далее в скрипт</w:t>
-      </w:r>
-      <w:r>
-        <w:t xml:space="preserve"> </w:t>
-      </w:r>
-      <w:r>
-        <w:rPr>
-          <w:rStyle w:val="VerbatimChar"/>
-        </w:rPr>
-        <w:t xml:space="preserve">/vagrant/provision/server/http.sh</w:t>
-      </w:r>
-      <w:r>
-        <w:t xml:space="preserve"> </w:t>
-      </w:r>
-      <w:r>
-        <w:t xml:space="preserve">внесены изменения: добавлена установка пакета</w:t>
-      </w:r>
-      <w:r>
-        <w:t xml:space="preserve"> </w:t>
-      </w:r>
-      <w:r>
-        <w:rPr>
-          <w:rStyle w:val="VerbatimChar"/>
-        </w:rPr>
-        <w:t xml:space="preserve">php</w:t>
-      </w:r>
-      <w:r>
-        <w:t xml:space="preserve">, реализовано копирование конфигурационных файлов в системные каталоги</w:t>
-      </w:r>
-      <w:r>
-        <w:t xml:space="preserve"> </w:t>
-      </w:r>
-      <w:r>
-        <w:rPr>
-          <w:rStyle w:val="VerbatimChar"/>
-        </w:rPr>
-        <w:t xml:space="preserve">/etc/httpd</w:t>
-      </w:r>
-      <w:r>
-        <w:t xml:space="preserve"> </w:t>
-      </w:r>
-      <w:r>
-        <w:t xml:space="preserve">и</w:t>
-      </w:r>
-      <w:r>
-        <w:t xml:space="preserve"> </w:t>
-      </w:r>
-      <w:r>
-        <w:rPr>
-          <w:rStyle w:val="VerbatimChar"/>
-        </w:rPr>
-        <w:t xml:space="preserve">/var/www</w:t>
-      </w:r>
-      <w:r>
-        <w:t xml:space="preserve">, выполнена корректировка владельца каталога</w:t>
-      </w:r>
-      <w:r>
-        <w:t xml:space="preserve"> </w:t>
-      </w:r>
-      <w:r>
-        <w:rPr>
-          <w:rStyle w:val="VerbatimChar"/>
-        </w:rPr>
-        <w:t xml:space="preserve">/var/www</w:t>
-      </w:r>
-      <w:r>
-        <w:t xml:space="preserve">, восстановление контекстов SELinux и добавлены правила межсетевого экрана для сервисов</w:t>
-      </w:r>
-      <w:r>
-        <w:t xml:space="preserve"> </w:t>
-      </w:r>
-      <w:r>
-        <w:rPr>
-          <w:rStyle w:val="VerbatimChar"/>
-        </w:rPr>
-        <w:t xml:space="preserve">http</w:t>
-      </w:r>
-      <w:r>
-        <w:t xml:space="preserve"> </w:t>
-      </w:r>
-      <w:r>
-        <w:t xml:space="preserve">и</w:t>
-      </w:r>
-      <w:r>
-        <w:t xml:space="preserve"> </w:t>
-      </w:r>
-      <w:r>
-        <w:rPr>
-          <w:rStyle w:val="VerbatimChar"/>
-        </w:rPr>
-        <w:t xml:space="preserve">https</w:t>
-      </w:r>
-      <w:r>
-        <w:t xml:space="preserve"> </w:t>
-      </w:r>
-      <w:r>
-        <w:t xml:space="preserve">с постоянным сохранением. В завершение настроено включение и запуск службы</w:t>
-      </w:r>
-      <w:r>
-        <w:t xml:space="preserve"> </w:t>
-      </w:r>
-      <w:r>
-        <w:rPr>
-          <w:rStyle w:val="VerbatimChar"/>
-        </w:rPr>
-        <w:t xml:space="preserve">httpd</w:t>
-      </w:r>
-      <w:r>
-        <w:t xml:space="preserve"> </w:t>
-      </w:r>
-      <w:r>
-        <w:t xml:space="preserve">(</w:t>
-      </w:r>
-      <w:hyperlink w:anchor="fig-9">
+      <w:bookmarkStart w:id="67" w:name="fig-9"/>
+      <w:r>
+        <w:drawing>
+          <wp:inline>
+            <wp:extent cx="3733800" cy="1933840"/>
+            <wp:effectExtent b="0" l="0" r="0" t="0"/>
+            <wp:docPr descr="Изменённый скрипт http.sh с установкой PHP и настройкой HTTPS" title="" id="65" name="Picture"/>
+            <a:graphic>
+              <a:graphicData uri="http://schemas.openxmlformats.org/drawingml/2006/picture">
+                <pic:pic>
+                  <pic:nvPicPr>
+                    <pic:cNvPr descr="image/9.png" id="66" name="Picture"/>
+                    <pic:cNvPicPr>
+                      <a:picLocks noChangeArrowheads="1" noChangeAspect="1"/>
+                    </pic:cNvPicPr>
+                  </pic:nvPicPr>
+                  <pic:blipFill>
+                    <a:blip r:embed="rId64"/>
+                    <a:stretch>
+                      <a:fillRect/>
+                    </a:stretch>
+                  </pic:blipFill>
+                  <pic:spPr bwMode="auto">
+                    <a:xfrm>
+                      <a:off x="0" y="0"/>
+                      <a:ext cx="3733800" cy="1933840"/>
+                    </a:xfrm>
+                    <a:prstGeom prst="rect">
+                      <a:avLst/>
+                    </a:prstGeom>
+                    <a:noFill/>
+                    <a:ln w="9525">
+                      <a:noFill/>
+                      <a:headEnd/>
+                      <a:tailEnd/>
+                    </a:ln>
+                  </pic:spPr>
+                </pic:pic>
+              </a:graphicData>
+            </a:graphic>
+          </wp:inline>
+        </w:drawing>
+      </w:r>
+      <w:bookmarkEnd w:id="67"/>
+      <w:r>
+        <w:t xml:space="preserve"> </w:t>
+      </w:r>
+      <w:hyperlink r:id="rId68">
         <w:r>
           <w:rPr>
             <w:rStyle w:val="Hyperlink"/>
           </w:rPr>
-          <w:t xml:space="preserve">рис. 9</w:t>
+          <w:t xml:space="preserve">Нажмите здесь, чтобы открыть ссылку.</w:t>
         </w:r>
       </w:hyperlink>
-      <w:r>
-        <w:t xml:space="preserve">).</w:t>
-      </w:r>
-    </w:p>
-    <w:tbl>
-      <w:tblPr>
-        <w:tblStyle w:val="Table"/>
-        <w:tblW w:type="pct" w:w="5000"/>
-        <w:tblLayout w:type="fixed"/>
-        <w:tblLook w:firstRow="0" w:lastRow="0" w:firstColumn="0" w:lastColumn="0" w:noHBand="0" w:noVBand="0" w:val="0000"/>
-      </w:tblPr>
-      <w:tblGrid>
-        <w:gridCol w:w="7920"/>
-      </w:tblGrid>
-      <w:tr>
-        <w:tc>
-          <w:tcPr/>
-          <w:bookmarkStart w:id="59" w:name="fig-9"/>
-          <w:p>
-            <w:pPr>
-              <w:pStyle w:val="Compact"/>
-              <w:jc w:val="center"/>
-            </w:pPr>
-            <w:r>
-              <w:drawing>
-                <wp:inline>
-                  <wp:extent cx="3733800" cy="1933840"/>
-                  <wp:effectExtent b="0" l="0" r="0" t="0"/>
-                  <wp:docPr descr="" title="" id="57" name="Picture"/>
-                  <a:graphic>
-                    <a:graphicData uri="http://schemas.openxmlformats.org/drawingml/2006/picture">
-                      <pic:pic>
-                        <pic:nvPicPr>
-                          <pic:cNvPr descr="image/9.png" id="58" name="Picture"/>
-                          <pic:cNvPicPr>
-                            <a:picLocks noChangeArrowheads="1" noChangeAspect="1"/>
-                          </pic:cNvPicPr>
-                        </pic:nvPicPr>
-                        <pic:blipFill>
-                          <a:blip r:embed="rId56"/>
-                          <a:stretch>
-                            <a:fillRect/>
-                          </a:stretch>
-                        </pic:blipFill>
-                        <pic:spPr bwMode="auto">
-                          <a:xfrm>
-                            <a:off x="0" y="0"/>
-                            <a:ext cx="3733800" cy="1933840"/>
-                          </a:xfrm>
-                          <a:prstGeom prst="rect">
-                            <a:avLst/>
-                          </a:prstGeom>
-                          <a:noFill/>
-                          <a:ln w="9525">
-                            <a:noFill/>
-                            <a:headEnd/>
-                            <a:tailEnd/>
-                          </a:ln>
-                        </pic:spPr>
-                      </pic:pic>
-                    </a:graphicData>
-                  </a:graphic>
-                </wp:inline>
-              </w:drawing>
-            </w:r>
-          </w:p>
-          <w:p>
-            <w:pPr>
-              <w:jc w:val="center"/>
-            </w:pPr>
-            <w:pPr>
-              <w:jc w:val="start"/>
-              <w:spacing w:before="200"/>
-              <w:pStyle w:val="ImageCaption"/>
-            </w:pPr>
-            <w:r>
-              <w:t xml:space="preserve">Рисунок 9: Изменённый скрипт http.sh с установкой PHP и настройкой HTTPS</w:t>
-            </w:r>
-          </w:p>
-          <w:bookmarkEnd w:id="59"/>
-        </w:tc>
-      </w:tr>
-    </w:tbl>
-    <w:bookmarkEnd w:id="60"/>
-    <w:bookmarkEnd w:id="61"/>
-    <w:bookmarkStart w:id="62" w:name="выводы"/>
+    </w:p>
+    <w:bookmarkEnd w:id="69"/>
+    <w:bookmarkEnd w:id="70"/>
+    <w:bookmarkStart w:id="71" w:name="выводы"/>
     <w:p>
       <w:pPr>
         <w:pStyle w:val="Heading1"/>
@@ -1665,8 +1485,8 @@
         <w:t xml:space="preserve">Работоспособность веб-сервера подтверждена успешным доступом к ресурсу по протоколу HTTPS и отображением страницы конфигурации PHP в браузере клиента.</w:t>
       </w:r>
     </w:p>
-    <w:bookmarkEnd w:id="62"/>
-    <w:bookmarkStart w:id="63" w:name="ответы-на-контрольные-вопросы"/>
+    <w:bookmarkEnd w:id="71"/>
+    <w:bookmarkStart w:id="72" w:name="ответы-на-контрольные-вопросы"/>
     <w:p>
       <w:pPr>
         <w:pStyle w:val="Heading1"/>
@@ -1796,7 +1616,7 @@
         <w:t xml:space="preserve">. Он предоставляет бесплатные SSL-сертификаты, которые используются для обеспечения безопасного соединения на множестве веб-сайтов. Владельцы веб-сайтов могут получить сертификат от Let’s Encrypt, чтобы обеспечить шифрование и подтвердить свою легитимность в онлайн-среде.</w:t>
       </w:r>
     </w:p>
-    <w:bookmarkEnd w:id="63"/>
+    <w:bookmarkEnd w:id="72"/>
     <w:sectPr/>
   </w:body>
 </w:document>

</xml_diff>